<commit_message>
Add trip duplication, cookie policy page, LT URLs, and invoice fixes
</commit_message>
<xml_diff>
--- a/BE/assets/documents/static/PVM_saskaita_faktura.docx
+++ b/BE/assets/documents/static/PVM_saskaita_faktura.docx
@@ -2377,7 +2377,7 @@
                 <w:szCs w:val="16"/>
                 <w:lang w:val="lt-LT" w:eastAsia="en-US" w:bidi="ar-SA"/>
               </w:rPr>
-              <w:t>Nuolaida su kodu ( -{couponDiscountPercent}%)</w:t>
+              <w:t>{#couponLine}Nuolaida su kodu ( -{couponDiscountPercent}%)</w:t>
             </w:r>
           </w:p>
         </w:tc>
@@ -2419,7 +2419,7 @@
                 <w:color w:val="000000"/>
                 <w:sz w:val="16"/>
               </w:rPr>
-              <w:t xml:space="preserve"> €</w:t>
+              <w:t xml:space="preserve"> €{/couponLine}</w:t>
             </w:r>
           </w:p>
         </w:tc>

</xml_diff>